<commit_message>
outline for 367 essay
</commit_message>
<xml_diff>
--- a/376/Major essay.docx
+++ b/376/Major essay.docx
@@ -40,6 +40,481 @@
         </w:rPr>
         <w:t xml:space="preserve"> is a lot like </w:t>
       </w:r>
+      <w:r>
+        <w:rPr>
+          <w:lang w:val="en-US"/>
+        </w:rPr>
+        <w:t>gambling</w:t>
+      </w:r>
+    </w:p>
+    <w:p>
+      <w:pPr>
+        <w:rPr>
+          <w:lang w:val="en-US"/>
+        </w:rPr>
+      </w:pPr>
+      <w:r>
+        <w:rPr>
+          <w:lang w:val="en-US"/>
+        </w:rPr>
+        <w:tab/>
+      </w:r>
+    </w:p>
+    <w:p>
+      <w:pPr>
+        <w:rPr>
+          <w:lang w:val="en-US"/>
+        </w:rPr>
+      </w:pPr>
+      <w:r>
+        <w:rPr>
+          <w:lang w:val="en-US"/>
+        </w:rPr>
+        <w:t>Social Media has a lot of research saying it causes mental health problems</w:t>
+      </w:r>
+    </w:p>
+    <w:p>
+      <w:pPr>
+        <w:ind w:left="720"/>
+        <w:rPr>
+          <w:lang w:val="en-US"/>
+        </w:rPr>
+      </w:pPr>
+      <w:r>
+        <w:t xml:space="preserve"> </w:t>
+      </w:r>
+      <w:hyperlink r:id="rId4" w:history="1">
+        <w:r>
+          <w:rPr>
+            <w:rStyle w:val="Hyperlink"/>
+            <w:lang w:val="en-US"/>
+          </w:rPr>
+          <w:t>https://www-sciencedirect-com.proxy.lib.sfu.ca/science/article/pii/S0747563220303927?via%3Dihub</w:t>
+        </w:r>
+      </w:hyperlink>
+    </w:p>
+    <w:p>
+      <w:pPr>
+        <w:ind w:left="720"/>
+        <w:rPr>
+          <w:lang w:val="en-US"/>
+        </w:rPr>
+      </w:pPr>
+      <w:r>
+        <w:rPr>
+          <w:lang w:val="en-US"/>
+        </w:rPr>
+        <w:t>https://www.publichealth.columbia.edu/news/just-how-harmful-social-media-our-experts-weigh</w:t>
+      </w:r>
+    </w:p>
+    <w:p>
+      <w:pPr>
+        <w:ind w:left="720"/>
+        <w:rPr>
+          <w:lang w:val="en-US"/>
+        </w:rPr>
+      </w:pPr>
+      <w:r>
+        <w:rPr>
+          <w:lang w:val="en-US"/>
+        </w:rPr>
+        <w:t>The current business model is based on maximizing</w:t>
+      </w:r>
+      <w:r>
+        <w:rPr>
+          <w:lang w:val="en-US"/>
+        </w:rPr>
+        <w:t xml:space="preserve"> </w:t>
+      </w:r>
+      <w:r>
+        <w:rPr>
+          <w:lang w:val="en-US"/>
+        </w:rPr>
+        <w:t>engagement, often based on disinformation, with no incentives to curb outrageous or false content, on the contrary,</w:t>
+      </w:r>
+      <w:r>
+        <w:rPr>
+          <w:lang w:val="en-US"/>
+        </w:rPr>
+        <w:t xml:space="preserve"> </w:t>
+      </w:r>
+      <w:r>
+        <w:rPr>
+          <w:lang w:val="en-US"/>
+        </w:rPr>
+        <w:t>outrage creates more engagement. In turn, incendiary</w:t>
+      </w:r>
+      <w:r>
+        <w:rPr>
+          <w:lang w:val="en-US"/>
+        </w:rPr>
+        <w:t xml:space="preserve"> </w:t>
+      </w:r>
+      <w:r>
+        <w:rPr>
+          <w:lang w:val="en-US"/>
+        </w:rPr>
+        <w:t>and hate speech has been associated with radicalization</w:t>
+      </w:r>
+      <w:r>
+        <w:rPr>
+          <w:lang w:val="en-US"/>
+        </w:rPr>
+        <w:t xml:space="preserve"> </w:t>
+      </w:r>
+      <w:r>
+        <w:rPr>
+          <w:lang w:val="en-US"/>
+        </w:rPr>
+        <w:t>of users, polarization, and social unrest.</w:t>
+      </w:r>
+    </w:p>
+    <w:p>
+      <w:pPr>
+        <w:ind w:left="720"/>
+        <w:rPr>
+          <w:lang w:val="en-US"/>
+        </w:rPr>
+      </w:pPr>
+      <w:r>
+        <w:rPr>
+          <w:lang w:val="en-US"/>
+        </w:rPr>
+        <w:tab/>
+      </w:r>
+      <w:r>
+        <w:rPr>
+          <w:lang w:val="en-US"/>
+        </w:rPr>
+        <w:t>https://www.un.org/sites/un2.un.org/files/attention_economy_feb.pdf</w:t>
+      </w:r>
+    </w:p>
+    <w:p>
+      <w:pPr>
+        <w:rPr>
+          <w:lang w:val="en-US"/>
+        </w:rPr>
+      </w:pPr>
+      <w:r>
+        <w:rPr>
+          <w:lang w:val="en-US"/>
+        </w:rPr>
+        <w:t>Social media will use gambling tactics to keep users engaged because of their business model relies on engagement</w:t>
+      </w:r>
+    </w:p>
+    <w:p>
+      <w:pPr>
+        <w:ind w:left="1440"/>
+        <w:rPr>
+          <w:lang w:val="en-US"/>
+        </w:rPr>
+      </w:pPr>
+      <w:r>
+        <w:rPr>
+          <w:lang w:val="en-US"/>
+        </w:rPr>
+        <w:t>h</w:t>
+      </w:r>
+      <w:hyperlink r:id="rId5" w:history="1">
+        <w:r>
+          <w:rPr>
+            <w:rStyle w:val="Hyperlink"/>
+            <w:lang w:val="en-US"/>
+          </w:rPr>
+          <w:t>ttps://www.theguardian.com/technology/2019/aug/23/social-media-a</w:t>
+        </w:r>
+      </w:hyperlink>
+      <w:r>
+        <w:rPr>
+          <w:lang w:val="en-US"/>
+        </w:rPr>
+        <w:t>ddiction-gambling</w:t>
+      </w:r>
+    </w:p>
+    <w:p>
+      <w:pPr>
+        <w:ind w:left="1440"/>
+        <w:rPr>
+          <w:lang w:val="en-US"/>
+        </w:rPr>
+      </w:pPr>
+      <w:r>
+        <w:t>he analogy between the gambler and the social-media junkie is hard to avoid. Tristan Harris, Google’s former design ethicist, calls your smartphone “</w:t>
+      </w:r>
+      <w:hyperlink r:id="rId6" w:history="1">
+        <w:r>
+          <w:rPr>
+            <w:rStyle w:val="Hyperlink"/>
+          </w:rPr>
+          <w:t>The Slot Machine in Your Pocket</w:t>
+        </w:r>
+      </w:hyperlink>
+      <w:r>
+        <w:t xml:space="preserve">”. Most smartphone apps use “intermittent variable rewards” to keep users hooked. Because rewards are variable, they are uncertain: you have to pull the lever to see what you are going to get. Adam Alter adds that, with the invention of the like button, users are gambling every time they post. The anthropologist Natasha Dow </w:t>
+      </w:r>
+      <w:proofErr w:type="spellStart"/>
+      <w:r>
+        <w:t>Schüll</w:t>
+      </w:r>
+      <w:proofErr w:type="spellEnd"/>
+      <w:r>
+        <w:t>, based on her work on machine gambling, agrees.</w:t>
+      </w:r>
+    </w:p>
+    <w:p>
+      <w:pPr>
+        <w:ind w:left="1440"/>
+        <w:rPr>
+          <w:lang w:val="en-US"/>
+        </w:rPr>
+      </w:pPr>
+      <w:r>
+        <w:rPr>
+          <w:lang w:val="en-US"/>
+        </w:rPr>
+        <w:t>ht</w:t>
+      </w:r>
+      <w:hyperlink r:id="rId7" w:history="1">
+        <w:r>
+          <w:rPr>
+            <w:rStyle w:val="Hyperlink"/>
+            <w:lang w:val="en-US"/>
+          </w:rPr>
+          <w:t>tps://falleneconomist.org/2022/07/11/las-vegas-and-the-attention-ec</w:t>
+        </w:r>
+      </w:hyperlink>
+      <w:r>
+        <w:rPr>
+          <w:lang w:val="en-US"/>
+        </w:rPr>
+        <w:t>onomy/</w:t>
+      </w:r>
+    </w:p>
+    <w:p>
+      <w:pPr>
+        <w:rPr>
+          <w:lang w:val="en-US"/>
+        </w:rPr>
+      </w:pPr>
+    </w:p>
+    <w:p>
+      <w:pPr>
+        <w:rPr>
+          <w:lang w:val="en-US"/>
+        </w:rPr>
+      </w:pPr>
+      <w:r>
+        <w:rPr>
+          <w:lang w:val="en-US"/>
+        </w:rPr>
+        <w:t>When we know something is harmful we don’t let children use it</w:t>
+      </w:r>
+    </w:p>
+    <w:p>
+      <w:pPr>
+        <w:ind w:left="720"/>
+        <w:rPr>
+          <w:lang w:val="en-US"/>
+        </w:rPr>
+      </w:pPr>
+      <w:r>
+        <w:rPr>
+          <w:lang w:val="en-US"/>
+        </w:rPr>
+        <w:lastRenderedPageBreak/>
+        <w:t xml:space="preserve">Gambling </w:t>
+      </w:r>
+    </w:p>
+    <w:p>
+      <w:pPr>
+        <w:ind w:left="720" w:firstLine="720"/>
+        <w:rPr>
+          <w:lang w:val="en-US"/>
+        </w:rPr>
+      </w:pPr>
+      <w:r>
+        <w:rPr>
+          <w:lang w:val="en-US"/>
+        </w:rPr>
+        <w:t>h</w:t>
+      </w:r>
+      <w:hyperlink r:id="rId8" w:history="1">
+        <w:r>
+          <w:rPr>
+            <w:rStyle w:val="Hyperlink"/>
+            <w:u w:val="none"/>
+            <w:lang w:val="en-US"/>
+          </w:rPr>
+          <w:t>ttps://academic-oup-c</w:t>
+        </w:r>
+      </w:hyperlink>
+      <w:r>
+        <w:rPr>
+          <w:lang w:val="en-US"/>
+        </w:rPr>
+        <w:t>om.proxy.lib.sfu.ca/book/27821/chapter/198099857</w:t>
+      </w:r>
+    </w:p>
+    <w:p>
+      <w:pPr>
+        <w:ind w:left="720"/>
+        <w:rPr>
+          <w:lang w:val="en-US"/>
+        </w:rPr>
+      </w:pPr>
+      <w:r>
+        <w:rPr>
+          <w:lang w:val="en-US"/>
+        </w:rPr>
+        <w:t xml:space="preserve">Drinking </w:t>
+      </w:r>
+    </w:p>
+    <w:p>
+      <w:pPr>
+        <w:ind w:left="1440"/>
+        <w:rPr>
+          <w:lang w:val="en-US"/>
+        </w:rPr>
+      </w:pPr>
+      <w:hyperlink r:id="rId9" w:history="1">
+        <w:r>
+          <w:rPr>
+            <w:rStyle w:val="Hyperlink"/>
+            <w:lang w:val="en-US"/>
+          </w:rPr>
+          <w:t>https://www.morningadvertiser.co.uk/Article/2019/02/11/Pub-policy-in-Parliament-over-the-last-225-years</w:t>
+        </w:r>
+      </w:hyperlink>
+    </w:p>
+    <w:p>
+      <w:pPr>
+        <w:ind w:left="1440"/>
+        <w:rPr>
+          <w:lang w:val="en-US"/>
+        </w:rPr>
+      </w:pPr>
+      <w:r>
+        <w:rPr>
+          <w:lang w:val="en-US"/>
+        </w:rPr>
+        <w:t>https://white-ribbon.org.uk/2021/05/14/1901-the-intoxicating-liquor-sale-to-children-act/</w:t>
+      </w:r>
+    </w:p>
+    <w:p>
+      <w:pPr>
+        <w:rPr>
+          <w:lang w:val="en-US"/>
+        </w:rPr>
+      </w:pPr>
+    </w:p>
+    <w:p>
+      <w:pPr>
+        <w:rPr>
+          <w:lang w:val="en-US"/>
+        </w:rPr>
+      </w:pPr>
+      <w:r>
+        <w:rPr>
+          <w:lang w:val="en-US"/>
+        </w:rPr>
+        <w:t>Social Media should be regulate for everyone because it is harmful to everyone. But there are lots of things that are harmful to us and we let adults do them.</w:t>
+      </w:r>
+    </w:p>
+    <w:p>
+      <w:pPr>
+        <w:rPr>
+          <w:lang w:val="en-US"/>
+        </w:rPr>
+      </w:pPr>
+      <w:r>
+        <w:rPr>
+          <w:lang w:val="en-US"/>
+        </w:rPr>
+        <w:tab/>
+        <w:t>Gambling</w:t>
+      </w:r>
+    </w:p>
+    <w:p>
+      <w:pPr>
+        <w:rPr>
+          <w:lang w:val="en-US"/>
+        </w:rPr>
+      </w:pPr>
+      <w:r>
+        <w:rPr>
+          <w:lang w:val="en-US"/>
+        </w:rPr>
+        <w:tab/>
+        <w:t>Drinking</w:t>
+      </w:r>
+    </w:p>
+    <w:p>
+      <w:pPr>
+        <w:rPr>
+          <w:lang w:val="en-US"/>
+        </w:rPr>
+      </w:pPr>
+      <w:r>
+        <w:rPr>
+          <w:lang w:val="en-US"/>
+        </w:rPr>
+        <w:tab/>
+        <w:t>Social contract theory</w:t>
+      </w:r>
+    </w:p>
+    <w:p>
+      <w:pPr>
+        <w:ind w:left="720"/>
+        <w:rPr>
+          <w:lang w:val="en-US"/>
+        </w:rPr>
+      </w:pPr>
+      <w:r>
+        <w:rPr>
+          <w:lang w:val="en-US"/>
+        </w:rPr>
+        <w:t>You can’t let you problems that are created because you do these harmful things harm other people</w:t>
+      </w:r>
+    </w:p>
+    <w:p>
+      <w:pPr>
+        <w:ind w:left="720"/>
+        <w:rPr>
+          <w:lang w:val="en-US"/>
+        </w:rPr>
+      </w:pPr>
+      <w:r>
+        <w:rPr>
+          <w:lang w:val="en-US"/>
+        </w:rPr>
+        <w:t>But we should</w:t>
+      </w:r>
+      <w:r>
+        <w:rPr>
+          <w:lang w:val="en-US"/>
+        </w:rPr>
+        <w:t xml:space="preserve"> stop</w:t>
+      </w:r>
+      <w:r>
+        <w:rPr>
+          <w:lang w:val="en-US"/>
+        </w:rPr>
+        <w:t xml:space="preserve"> people to do things they want even if it harm them they are free to do them, this rule breaks down when children don’t have a fully developed frontal lobe that controls decision. Need to find a source / ask if I need a source.</w:t>
+      </w:r>
+    </w:p>
+    <w:p>
+      <w:pPr>
+        <w:rPr>
+          <w:lang w:val="en-US"/>
+        </w:rPr>
+      </w:pPr>
+    </w:p>
+    <w:p>
+      <w:pPr>
+        <w:rPr>
+          <w:lang w:val="en-US"/>
+        </w:rPr>
+      </w:pPr>
     </w:p>
     <w:p>
       <w:pPr>
@@ -516,7 +991,6 @@
     <w:next w:val="Normal"/>
     <w:link w:val="Heading3Char"/>
     <w:uiPriority w:val="9"/>
-    <w:semiHidden/>
     <w:unhideWhenUsed/>
     <w:qFormat/>
     <w:rsid w:val="00B9575C"/>
@@ -724,7 +1198,6 @@
     <w:basedOn w:val="DefaultParagraphFont"/>
     <w:link w:val="Heading3"/>
     <w:uiPriority w:val="9"/>
-    <w:semiHidden/>
     <w:rsid w:val="00B9575C"/>
     <w:rPr>
       <w:rFonts w:eastAsiaTheme="majorEastAsia" w:cstheme="majorBidi"/>
@@ -980,6 +1453,29 @@
       <w:smallCaps/>
       <w:color w:val="0F4761" w:themeColor="accent1" w:themeShade="BF"/>
       <w:spacing w:val="5"/>
+    </w:rPr>
+  </w:style>
+  <w:style w:type="character" w:styleId="Hyperlink">
+    <w:name w:val="Hyperlink"/>
+    <w:basedOn w:val="DefaultParagraphFont"/>
+    <w:uiPriority w:val="99"/>
+    <w:unhideWhenUsed/>
+    <w:rsid w:val="00E91240"/>
+    <w:rPr>
+      <w:color w:val="467886" w:themeColor="hyperlink"/>
+      <w:u w:val="single"/>
+    </w:rPr>
+  </w:style>
+  <w:style w:type="character" w:styleId="UnresolvedMention">
+    <w:name w:val="Unresolved Mention"/>
+    <w:basedOn w:val="DefaultParagraphFont"/>
+    <w:uiPriority w:val="99"/>
+    <w:semiHidden/>
+    <w:unhideWhenUsed/>
+    <w:rsid w:val="00E91240"/>
+    <w:rPr>
+      <w:color w:val="605E5C"/>
+      <w:shd w:val="clear" w:color="auto" w:fill="E1DFDD"/>
     </w:rPr>
   </w:style>
 </w:styles>

</xml_diff>

<commit_message>
not done yet 376
</commit_message>
<xml_diff>
--- a/376/Major essay.docx
+++ b/376/Major essay.docx
@@ -12,7 +12,21 @@
         <w:rPr>
           <w:lang w:val="en-US"/>
         </w:rPr>
-        <w:t>Businesses that only revenue is their user actively be on their products should illegal for children to use.</w:t>
+        <w:t xml:space="preserve">Businesses that only revenue is their user actively be on their products </w:t>
+      </w:r>
+      <w:proofErr w:type="gramStart"/>
+      <w:r>
+        <w:rPr>
+          <w:lang w:val="en-US"/>
+        </w:rPr>
+        <w:t>should</w:t>
+      </w:r>
+      <w:proofErr w:type="gramEnd"/>
+      <w:r>
+        <w:rPr>
+          <w:lang w:val="en-US"/>
+        </w:rPr>
+        <w:t xml:space="preserve"> illegal for children to use.</w:t>
       </w:r>
     </w:p>
     <w:p>
@@ -66,16 +80,87 @@
           <w:lang w:val="en-US"/>
         </w:rPr>
       </w:pPr>
-      <w:r>
-        <w:rPr>
-          <w:lang w:val="en-US"/>
-        </w:rPr>
-        <w:t>Social Media has a lot of research saying it causes mental health problems</w:t>
+      <w:proofErr w:type="gramStart"/>
+      <w:r>
+        <w:rPr>
+          <w:lang w:val="en-US"/>
+        </w:rPr>
+        <w:t>Social Media</w:t>
+      </w:r>
+      <w:proofErr w:type="gramEnd"/>
+      <w:r>
+        <w:rPr>
+          <w:lang w:val="en-US"/>
+        </w:rPr>
+        <w:t xml:space="preserve"> has a lot of research saying it causes mental health problems</w:t>
       </w:r>
     </w:p>
     <w:p>
       <w:pPr>
         <w:ind w:left="720"/>
+        <w:rPr>
+          <w:lang w:val="en-US"/>
+        </w:rPr>
+      </w:pPr>
+      <w:r>
+        <w:rPr>
+          <w:lang w:val="en-US"/>
+        </w:rPr>
+        <w:t>More specifically, problematic social media use has been related to psychological</w:t>
+      </w:r>
+      <w:r>
+        <w:rPr>
+          <w:lang w:val="en-US"/>
+        </w:rPr>
+        <w:t xml:space="preserve"> </w:t>
+      </w:r>
+      <w:r>
+        <w:rPr>
+          <w:lang w:val="en-US"/>
+        </w:rPr>
+        <w:t>distress,</w:t>
+      </w:r>
+      <w:r>
+        <w:rPr>
+          <w:lang w:val="en-US"/>
+        </w:rPr>
+        <w:t xml:space="preserve"> </w:t>
+      </w:r>
+      <w:r>
+        <w:rPr>
+          <w:lang w:val="en-US"/>
+        </w:rPr>
+        <w:t>including stress, anxiety and depression</w:t>
+      </w:r>
+    </w:p>
+    <w:p>
+      <w:pPr>
+        <w:rPr>
+          <w:lang w:val="en-US"/>
+        </w:rPr>
+      </w:pPr>
+      <w:r>
+        <w:rPr>
+          <w:lang w:val="en-US"/>
+        </w:rPr>
+        <w:tab/>
+      </w:r>
+      <w:r>
+        <w:rPr>
+          <w:lang w:val="en-US"/>
+        </w:rPr>
+        <w:tab/>
+      </w:r>
+      <w:r>
+        <w:rPr>
+          <w:lang w:val="en-US"/>
+        </w:rPr>
+        <w:t>https://onlinelibrary.wiley.com/doi/pdfdirect/10.1111/hex.13169</w:t>
+      </w:r>
+    </w:p>
+    <w:p>
+      <w:pPr>
+        <w:ind w:left="720"/>
       </w:pPr>
       <w:r>
         <w:rPr>
@@ -85,10 +170,7 @@
         <w:t>“</w:t>
       </w:r>
       <w:r>
-        <w:t>Moreover, SMU problems were found to increase upward social comparisons and cybervictimization, which implies that adolescents with SMU problems face multiple adversities</w:t>
-      </w:r>
-      <w:r>
-        <w:t>”</w:t>
+        <w:t>Moreover, SMU problems were found to increase upward social comparisons and cybervictimization, which implies that adolescents with SMU problems face multiple adversities”</w:t>
       </w:r>
     </w:p>
     <w:p>
@@ -265,7 +347,27 @@
         </w:r>
       </w:hyperlink>
       <w:r>
-        <w:t>”. Most smartphone apps use “intermittent variable rewards” to keep users hooked. Because rewards are variable, they are uncertain: you have to pull the lever to see what you are going to get. Adam Alter adds that, with the invention of the like button, users are gambling every time they post. The anthropologist Natasha Dow Schüll, based on her work on machine gambling, agrees.</w:t>
+        <w:t xml:space="preserve">”. Most smartphone apps use “intermittent variable rewards” to keep users hooked. Because rewards are variable, they are uncertain: you </w:t>
+      </w:r>
+      <w:proofErr w:type="gramStart"/>
+      <w:r>
+        <w:t>have to</w:t>
+      </w:r>
+      <w:proofErr w:type="gramEnd"/>
+      <w:r>
+        <w:t xml:space="preserve"> pull the lever to see what you are going to get. Adam Alter adds that, with the </w:t>
+      </w:r>
+      <w:r>
+        <w:lastRenderedPageBreak/>
+        <w:t xml:space="preserve">invention of the like button, users are gambling every time they post. The anthropologist Natasha Dow </w:t>
+      </w:r>
+      <w:proofErr w:type="spellStart"/>
+      <w:r>
+        <w:t>Schüll</w:t>
+      </w:r>
+      <w:proofErr w:type="spellEnd"/>
+      <w:r>
+        <w:t>, based on her work on machine gambling, agrees.</w:t>
       </w:r>
     </w:p>
     <w:p>
@@ -276,7 +378,6 @@
         <w:rPr>
           <w:lang w:val="en-US"/>
         </w:rPr>
-        <w:lastRenderedPageBreak/>
         <w:t>h</w:t>
       </w:r>
       <w:hyperlink r:id="rId7" w:history="1">
@@ -373,7 +474,21 @@
         <w:rPr>
           <w:lang w:val="en-US"/>
         </w:rPr>
-        <w:t>When we know something is harmful we don’t let children use it</w:t>
+        <w:t xml:space="preserve">When we know something is </w:t>
+      </w:r>
+      <w:proofErr w:type="gramStart"/>
+      <w:r>
+        <w:rPr>
+          <w:lang w:val="en-US"/>
+        </w:rPr>
+        <w:t>harmful</w:t>
+      </w:r>
+      <w:proofErr w:type="gramEnd"/>
+      <w:r>
+        <w:rPr>
+          <w:lang w:val="en-US"/>
+        </w:rPr>
+        <w:t xml:space="preserve"> we don’t let children use it</w:t>
       </w:r>
     </w:p>
     <w:p>
@@ -458,31 +573,84 @@
           <w:lang w:val="en-US"/>
         </w:rPr>
       </w:pPr>
-      <w:r>
-        <w:rPr>
-          <w:lang w:val="en-US"/>
-        </w:rPr>
-        <w:t>https://white-ribbon.org.uk/2021/05/14/1901-the-intoxicating-liquor-sale-to-children-act/</w:t>
-      </w:r>
-    </w:p>
-    <w:p>
-      <w:pPr>
-        <w:rPr>
-          <w:lang w:val="en-US"/>
-        </w:rPr>
-      </w:pPr>
-    </w:p>
-    <w:p>
-      <w:pPr>
-        <w:rPr>
-          <w:lang w:val="en-US"/>
-        </w:rPr>
-      </w:pPr>
-      <w:r>
-        <w:rPr>
-          <w:lang w:val="en-US"/>
-        </w:rPr>
-        <w:t>Social Media should be regulate for everyone because it is harmful to everyone. But there are lots of things that are harmful to us and we let adults do them.</w:t>
+      <w:hyperlink r:id="rId11" w:history="1">
+        <w:r>
+          <w:rPr>
+            <w:rStyle w:val="Hyperlink"/>
+            <w:lang w:val="en-US"/>
+          </w:rPr>
+          <w:t>https://white-ribbon.org.uk/2021/05/14/1901-the-intoxicating-liquor-sale-to-children-act/</w:t>
+        </w:r>
+      </w:hyperlink>
+    </w:p>
+    <w:p>
+      <w:pPr>
+        <w:rPr>
+          <w:lang w:val="en-US"/>
+        </w:rPr>
+      </w:pPr>
+      <w:r>
+        <w:rPr>
+          <w:lang w:val="en-US"/>
+        </w:rPr>
+        <w:tab/>
+        <w:t>Tobacco</w:t>
+      </w:r>
+    </w:p>
+    <w:p>
+      <w:pPr>
+        <w:rPr>
+          <w:lang w:val="en-US"/>
+        </w:rPr>
+      </w:pPr>
+    </w:p>
+    <w:p>
+      <w:pPr>
+        <w:rPr>
+          <w:lang w:val="en-US"/>
+        </w:rPr>
+      </w:pPr>
+      <w:proofErr w:type="gramStart"/>
+      <w:r>
+        <w:rPr>
+          <w:lang w:val="en-US"/>
+        </w:rPr>
+        <w:t>Social Media</w:t>
+      </w:r>
+      <w:proofErr w:type="gramEnd"/>
+      <w:r>
+        <w:rPr>
+          <w:lang w:val="en-US"/>
+        </w:rPr>
+        <w:t xml:space="preserve"> should be </w:t>
+      </w:r>
+      <w:proofErr w:type="gramStart"/>
+      <w:r>
+        <w:rPr>
+          <w:lang w:val="en-US"/>
+        </w:rPr>
+        <w:t>regulate</w:t>
+      </w:r>
+      <w:proofErr w:type="gramEnd"/>
+      <w:r>
+        <w:rPr>
+          <w:lang w:val="en-US"/>
+        </w:rPr>
+        <w:t xml:space="preserve"> for everyone because it is harmful to everyone. But there are lots of things that are harmful to </w:t>
+      </w:r>
+      <w:proofErr w:type="gramStart"/>
+      <w:r>
+        <w:rPr>
+          <w:lang w:val="en-US"/>
+        </w:rPr>
+        <w:t>us</w:t>
+      </w:r>
+      <w:proofErr w:type="gramEnd"/>
+      <w:r>
+        <w:rPr>
+          <w:lang w:val="en-US"/>
+        </w:rPr>
+        <w:t xml:space="preserve"> and we let adults do them.</w:t>
       </w:r>
     </w:p>
     <w:p>
@@ -524,6 +692,20 @@
           <w:lang w:val="en-US"/>
         </w:rPr>
         <w:tab/>
+        <w:t>Tobacco</w:t>
+      </w:r>
+    </w:p>
+    <w:p>
+      <w:pPr>
+        <w:rPr>
+          <w:lang w:val="en-US"/>
+        </w:rPr>
+      </w:pPr>
+      <w:r>
+        <w:rPr>
+          <w:lang w:val="en-US"/>
+        </w:rPr>
+        <w:tab/>
         <w:t>Social contract theory</w:t>
       </w:r>
     </w:p>
@@ -538,7 +720,22 @@
         <w:rPr>
           <w:lang w:val="en-US"/>
         </w:rPr>
-        <w:t>You can’t let you problems that are created because you do these harmful things harm other people</w:t>
+        <w:lastRenderedPageBreak/>
+        <w:t xml:space="preserve">You can’t let </w:t>
+      </w:r>
+      <w:proofErr w:type="gramStart"/>
+      <w:r>
+        <w:rPr>
+          <w:lang w:val="en-US"/>
+        </w:rPr>
+        <w:t>you</w:t>
+      </w:r>
+      <w:proofErr w:type="gramEnd"/>
+      <w:r>
+        <w:rPr>
+          <w:lang w:val="en-US"/>
+        </w:rPr>
+        <w:t xml:space="preserve"> problems that are created because you do these harmful things harm other people</w:t>
       </w:r>
     </w:p>
     <w:p>
@@ -564,7 +761,93 @@
         <w:rPr>
           <w:lang w:val="en-US"/>
         </w:rPr>
-        <w:t xml:space="preserve"> people to do things they want even if it harm them they are free to do them, this rule breaks down when children don’t have a fully developed frontal lobe that controls decision. Need to find a source / ask if I need a source.</w:t>
+        <w:t xml:space="preserve"> people </w:t>
+      </w:r>
+      <w:proofErr w:type="gramStart"/>
+      <w:r>
+        <w:rPr>
+          <w:lang w:val="en-US"/>
+        </w:rPr>
+        <w:t>to do</w:t>
+      </w:r>
+      <w:proofErr w:type="gramEnd"/>
+      <w:r>
+        <w:rPr>
+          <w:lang w:val="en-US"/>
+        </w:rPr>
+        <w:t xml:space="preserve"> things they want even if it </w:t>
+      </w:r>
+      <w:proofErr w:type="gramStart"/>
+      <w:r>
+        <w:rPr>
+          <w:lang w:val="en-US"/>
+        </w:rPr>
+        <w:t>harm</w:t>
+      </w:r>
+      <w:proofErr w:type="gramEnd"/>
+      <w:r>
+        <w:rPr>
+          <w:lang w:val="en-US"/>
+        </w:rPr>
+        <w:t xml:space="preserve"> them they are free to do them, this rule breaks down when children don’t have a fully developed frontal lobe that controls decision. Need to find a source / ask if I need a source.</w:t>
+      </w:r>
+    </w:p>
+    <w:p>
+      <w:pPr>
+        <w:ind w:left="720"/>
+        <w:rPr>
+          <w:lang w:val="en-US"/>
+        </w:rPr>
+      </w:pPr>
+    </w:p>
+    <w:p>
+      <w:pPr>
+        <w:ind w:left="720"/>
+        <w:rPr>
+          <w:lang w:val="en-US"/>
+        </w:rPr>
+      </w:pPr>
+      <w:r>
+        <w:t>Switzerland has established criteria set by the Swiss Academy of Medical Sciences (ASSM): Candidates must be adult, have their full powers of judgment, be capable of self-administering the lethal dose, and be suffering from an incurable disease, or be plagued with unbearable suffering, or disabling multiple pathologies associated with old age</w:t>
+      </w:r>
+    </w:p>
+    <w:p>
+      <w:pPr>
+        <w:ind w:left="1440"/>
+        <w:rPr>
+          <w:lang w:val="en-US"/>
+        </w:rPr>
+      </w:pPr>
+      <w:hyperlink r:id="rId12" w:history="1">
+        <w:r>
+          <w:rPr>
+            <w:rStyle w:val="Hyperlink"/>
+            <w:lang w:val="en-US"/>
+          </w:rPr>
+          <w:t>https://www.alliancevita.org/en/2023/10/switzerland-worrying-changes-in-the-practice-of-assisted-suicide/</w:t>
+        </w:r>
+      </w:hyperlink>
+    </w:p>
+    <w:p>
+      <w:pPr>
+        <w:ind w:left="1440"/>
+        <w:rPr>
+          <w:lang w:val="en-US"/>
+        </w:rPr>
+      </w:pPr>
+    </w:p>
+    <w:p>
+      <w:pPr>
+        <w:ind w:left="1440"/>
+        <w:rPr>
+          <w:lang w:val="en-US"/>
+        </w:rPr>
+      </w:pPr>
+      <w:r>
+        <w:rPr>
+          <w:lang w:val="en-US"/>
+        </w:rPr>
+        <w:t>https://www.un.org/en/about-us/universal-declaration-of-human-rights</w:t>
       </w:r>
     </w:p>
     <w:sectPr>

</xml_diff>

<commit_message>
New plan for 376 essay
</commit_message>
<xml_diff>
--- a/376/Major essay.docx
+++ b/376/Major essay.docx
@@ -759,12 +759,253 @@
           <w:lang w:val="en-US"/>
         </w:rPr>
       </w:pPr>
-      <w:r>
-        <w:rPr>
-          <w:lang w:val="en-US"/>
-        </w:rPr>
-        <w:t>https://www.olg.ca/en/my-play-break.html</w:t>
-      </w:r>
+      <w:hyperlink r:id="rId14" w:history="1">
+        <w:r>
+          <w:rPr>
+            <w:rStyle w:val="Hyperlink"/>
+            <w:lang w:val="en-US"/>
+          </w:rPr>
+          <w:t>https://www.olg.ca/en/my-play-break.html</w:t>
+        </w:r>
+      </w:hyperlink>
+    </w:p>
+    <w:p>
+      <w:pPr>
+        <w:rPr>
+          <w:lang w:val="en-US"/>
+        </w:rPr>
+      </w:pPr>
+    </w:p>
+    <w:p>
+      <w:pPr>
+        <w:rPr>
+          <w:lang w:val="en-US"/>
+        </w:rPr>
+      </w:pPr>
+      <w:r>
+        <w:rPr>
+          <w:lang w:val="en-US"/>
+        </w:rPr>
+        <w:br w:type="page"/>
+      </w:r>
+    </w:p>
+    <w:p>
+      <w:pPr>
+        <w:rPr>
+          <w:lang w:val="en-US"/>
+        </w:rPr>
+      </w:pPr>
+      <w:r>
+        <w:rPr>
+          <w:lang w:val="en-US"/>
+        </w:rPr>
+        <w:lastRenderedPageBreak/>
+        <w:t>describe data mining to sell to advertisers</w:t>
+      </w:r>
+    </w:p>
+    <w:p>
+      <w:pPr>
+        <w:rPr>
+          <w:lang w:val="en-US"/>
+        </w:rPr>
+      </w:pPr>
+    </w:p>
+    <w:p>
+      <w:pPr>
+        <w:rPr>
+          <w:lang w:val="en-US"/>
+        </w:rPr>
+      </w:pPr>
+      <w:r>
+        <w:rPr>
+          <w:lang w:val="en-US"/>
+        </w:rPr>
+        <w:t>Why this is a problem</w:t>
+      </w:r>
+    </w:p>
+    <w:p>
+      <w:pPr>
+        <w:rPr>
+          <w:lang w:val="en-US"/>
+        </w:rPr>
+      </w:pPr>
+      <w:r>
+        <w:rPr>
+          <w:lang w:val="en-US"/>
+        </w:rPr>
+        <w:t xml:space="preserve">Insentivise addictive design – engagement metric </w:t>
+      </w:r>
+    </w:p>
+    <w:p>
+      <w:pPr>
+        <w:rPr>
+          <w:lang w:val="en-US"/>
+        </w:rPr>
+      </w:pPr>
+      <w:r>
+        <w:rPr>
+          <w:lang w:val="en-US"/>
+        </w:rPr>
+        <w:t xml:space="preserve">When something is addictive – gambling – it need to be protected and warned about </w:t>
+      </w:r>
+    </w:p>
+    <w:p>
+      <w:pPr>
+        <w:rPr>
+          <w:lang w:val="en-US"/>
+        </w:rPr>
+      </w:pPr>
+      <w:r>
+        <w:rPr>
+          <w:lang w:val="en-US"/>
+        </w:rPr>
+        <w:t>Why video games are different – have their own problems but are specifically are incentivized to be addictive. Different models, substricption just incentives wanting to play once a month, All up front, micro transactions</w:t>
+      </w:r>
+    </w:p>
+    <w:p>
+      <w:pPr>
+        <w:rPr>
+          <w:lang w:val="en-US"/>
+        </w:rPr>
+      </w:pPr>
+      <w:r>
+        <w:rPr>
+          <w:lang w:val="en-US"/>
+        </w:rPr>
+        <w:t>Netflix – again has its own problems but it is a subscription</w:t>
+      </w:r>
+    </w:p>
+    <w:p>
+      <w:pPr>
+        <w:rPr>
+          <w:lang w:val="en-US"/>
+        </w:rPr>
+      </w:pPr>
+      <w:r>
+        <w:rPr>
+          <w:lang w:val="en-US"/>
+        </w:rPr>
+        <w:t>Google – best counter argument, google make all money from data, but you aren’t incentivized to use for every, you need to actively be seaking for something and you want to be answered as fast as possible. Not in entertainment.</w:t>
+      </w:r>
+    </w:p>
+    <w:p>
+      <w:pPr>
+        <w:rPr>
+          <w:lang w:val="en-US"/>
+        </w:rPr>
+      </w:pPr>
+      <w:r>
+        <w:rPr>
+          <w:lang w:val="en-US"/>
+        </w:rPr>
+        <w:t>Television – very close relative – not 100% insensitived to be addictive</w:t>
+      </w:r>
+    </w:p>
+    <w:p>
+      <w:pPr>
+        <w:rPr>
+          <w:lang w:val="en-US"/>
+        </w:rPr>
+      </w:pPr>
+    </w:p>
+    <w:p>
+      <w:pPr>
+        <w:rPr>
+          <w:lang w:val="en-US"/>
+        </w:rPr>
+      </w:pPr>
+      <w:r>
+        <w:rPr>
+          <w:lang w:val="en-US"/>
+        </w:rPr>
+        <w:t xml:space="preserve">Should we stop adults from doing these things </w:t>
+      </w:r>
+    </w:p>
+    <w:p>
+      <w:pPr>
+        <w:rPr>
+          <w:lang w:val="en-US"/>
+        </w:rPr>
+      </w:pPr>
+      <w:r>
+        <w:rPr>
+          <w:lang w:val="en-US"/>
+        </w:rPr>
+        <w:t>Tobacco, alcohol, gambling</w:t>
+      </w:r>
+    </w:p>
+    <w:p>
+      <w:pPr>
+        <w:rPr>
+          <w:lang w:val="en-US"/>
+        </w:rPr>
+      </w:pPr>
+    </w:p>
+    <w:p>
+      <w:pPr>
+        <w:rPr>
+          <w:lang w:val="en-US"/>
+        </w:rPr>
+      </w:pPr>
+      <w:r>
+        <w:rPr>
+          <w:lang w:val="en-US"/>
+        </w:rPr>
+        <w:t>Ethical analysis of lack of education.</w:t>
+      </w:r>
+    </w:p>
+    <w:p>
+      <w:pPr>
+        <w:rPr>
+          <w:lang w:val="en-US"/>
+        </w:rPr>
+      </w:pPr>
+      <w:r>
+        <w:rPr>
+          <w:lang w:val="en-US"/>
+        </w:rPr>
+        <w:t>Kantiensim</w:t>
+      </w:r>
+    </w:p>
+    <w:p>
+      <w:pPr>
+        <w:rPr>
+          <w:lang w:val="en-US"/>
+        </w:rPr>
+      </w:pPr>
+      <w:r>
+        <w:rPr>
+          <w:lang w:val="en-US"/>
+        </w:rPr>
+        <w:t>Rules Unitilaterism</w:t>
+      </w:r>
+    </w:p>
+    <w:p>
+      <w:pPr>
+        <w:rPr>
+          <w:lang w:val="en-US"/>
+        </w:rPr>
+      </w:pPr>
+      <w:r>
+        <w:rPr>
+          <w:lang w:val="en-US"/>
+        </w:rPr>
+        <w:t xml:space="preserve">Social Contract theory </w:t>
+      </w:r>
+    </w:p>
+    <w:p>
+      <w:pPr>
+        <w:rPr>
+          <w:lang w:val="en-US"/>
+        </w:rPr>
+      </w:pPr>
+    </w:p>
+    <w:p>
+      <w:pPr>
+        <w:rPr>
+          <w:lang w:val="en-US"/>
+        </w:rPr>
+      </w:pPr>
     </w:p>
     <w:sectPr>
       <w:pgSz w:w="12240" w:h="15840"/>

</xml_diff>

<commit_message>
draft essay and format placeholder
</commit_message>
<xml_diff>
--- a/376/Major essay.docx
+++ b/376/Major essay.docx
@@ -12,7 +12,21 @@
         <w:rPr>
           <w:lang w:val="en-US"/>
         </w:rPr>
-        <w:t>Businesses that only revenue is their user actively be on their products should illegal for children to use.</w:t>
+        <w:t xml:space="preserve">Businesses that only revenue is their user actively be on their products </w:t>
+      </w:r>
+      <w:proofErr w:type="gramStart"/>
+      <w:r>
+        <w:rPr>
+          <w:lang w:val="en-US"/>
+        </w:rPr>
+        <w:t>should</w:t>
+      </w:r>
+      <w:proofErr w:type="gramEnd"/>
+      <w:r>
+        <w:rPr>
+          <w:lang w:val="en-US"/>
+        </w:rPr>
+        <w:t xml:space="preserve"> illegal for children to use.</w:t>
       </w:r>
     </w:p>
     <w:p>
@@ -66,11 +80,19 @@
           <w:lang w:val="en-US"/>
         </w:rPr>
       </w:pPr>
-      <w:r>
-        <w:rPr>
-          <w:lang w:val="en-US"/>
-        </w:rPr>
-        <w:t>Social Media has a lot of research saying it causes mental health problems</w:t>
+      <w:proofErr w:type="gramStart"/>
+      <w:r>
+        <w:rPr>
+          <w:lang w:val="en-US"/>
+        </w:rPr>
+        <w:t>Social Media</w:t>
+      </w:r>
+      <w:proofErr w:type="gramEnd"/>
+      <w:r>
+        <w:rPr>
+          <w:lang w:val="en-US"/>
+        </w:rPr>
+        <w:t xml:space="preserve"> has a lot of research saying it causes mental health problems</w:t>
       </w:r>
     </w:p>
     <w:p>
@@ -129,13 +151,58 @@
         </w:rPr>
         <w:tab/>
       </w:r>
-      <w:r>
-        <w:rPr>
-          <w:lang w:val="en-US"/>
-        </w:rPr>
-        <w:t>https://onlinelibrary.wiley.com/doi/pdfdirect/10.1111/hex.13169</w:t>
-      </w:r>
-    </w:p>
+      <w:hyperlink r:id="rId4" w:history="1">
+        <w:r>
+          <w:rPr>
+            <w:rStyle w:val="Hyperlink"/>
+            <w:lang w:val="en-US"/>
+          </w:rPr>
+          <w:t>https://onlinelibrary.wiley.com/doi/pdfdirect/10.1111/hex.13169</w:t>
+        </w:r>
+      </w:hyperlink>
+    </w:p>
+    <w:p>
+      <w:r>
+        <w:t xml:space="preserve">[1] C. Lin, P. Namdar, M. D. Griffiths, and A. H. </w:t>
+      </w:r>
+      <w:proofErr w:type="spellStart"/>
+      <w:r>
+        <w:t>Pakpour</w:t>
+      </w:r>
+      <w:proofErr w:type="spellEnd"/>
+      <w:r>
+        <w:t>, “Mediated roles of Generalized Trust and perceived social support in the effects of problematic social media use on Mental Health: A cross</w:t>
+      </w:r>
+      <w:r>
+        <w:rPr>
+          <w:rFonts w:ascii="Cambria Math" w:hAnsi="Cambria Math" w:cs="Cambria Math"/>
+        </w:rPr>
+        <w:t>‐</w:t>
+      </w:r>
+      <w:r>
+        <w:t>sectional study,</w:t>
+      </w:r>
+      <w:r>
+        <w:rPr>
+          <w:rFonts w:ascii="Aptos" w:hAnsi="Aptos" w:cs="Aptos"/>
+        </w:rPr>
+        <w:t>”</w:t>
+      </w:r>
+      <w:r>
+        <w:t xml:space="preserve"> </w:t>
+      </w:r>
+      <w:r>
+        <w:rPr>
+          <w:i/>
+          <w:iCs/>
+        </w:rPr>
+        <w:t>Health Expectations</w:t>
+      </w:r>
+      <w:r>
+        <w:t xml:space="preserve">, vol. 24, no. 1, pp. 165–173, Nov. 2020. doi:10.1111/hex.13169 </w:t>
+      </w:r>
+    </w:p>
+    <w:p/>
     <w:p>
       <w:pPr>
         <w:ind w:left="720"/>
@@ -159,7 +226,7 @@
           <w:lang w:val="en-US"/>
         </w:rPr>
       </w:pPr>
-      <w:hyperlink r:id="rId4" w:history="1">
+      <w:hyperlink r:id="rId5" w:history="1">
         <w:r>
           <w:rPr>
             <w:rStyle w:val="Hyperlink"/>
@@ -171,6 +238,70 @@
     </w:p>
     <w:p>
       <w:pPr>
+        <w:ind w:left="1440"/>
+        <w:rPr>
+          <w:rStyle w:val="Hyperlink"/>
+          <w:lang w:val="en-US"/>
+        </w:rPr>
+      </w:pPr>
+      <w:r>
+        <w:rPr>
+          <w:rStyle w:val="Hyperlink"/>
+          <w:lang w:val="en-US"/>
+        </w:rPr>
+        <w:t xml:space="preserve">[1] M. Boer, G. W. J. M. Stevens, C. </w:t>
+      </w:r>
+      <w:proofErr w:type="spellStart"/>
+      <w:r>
+        <w:rPr>
+          <w:rStyle w:val="Hyperlink"/>
+          <w:lang w:val="en-US"/>
+        </w:rPr>
+        <w:t>Finkenauer</w:t>
+      </w:r>
+      <w:proofErr w:type="spellEnd"/>
+      <w:r>
+        <w:rPr>
+          <w:rStyle w:val="Hyperlink"/>
+          <w:lang w:val="en-US"/>
+        </w:rPr>
+        <w:t xml:space="preserve">, M. E. de Looze, and R. J. J. M. van den </w:t>
+      </w:r>
+      <w:proofErr w:type="spellStart"/>
+      <w:r>
+        <w:rPr>
+          <w:rStyle w:val="Hyperlink"/>
+          <w:lang w:val="en-US"/>
+        </w:rPr>
+        <w:t>Eijnden</w:t>
+      </w:r>
+      <w:proofErr w:type="spellEnd"/>
+      <w:r>
+        <w:rPr>
+          <w:rStyle w:val="Hyperlink"/>
+          <w:lang w:val="en-US"/>
+        </w:rPr>
+        <w:t xml:space="preserve">, “Social media use intensity, social media use problems, and mental health among adolescents: Investigating directionality and mediating processes,” Computers in Human Behavior, vol. 116, p. 106645, Mar. 2021. </w:t>
+      </w:r>
+      <w:proofErr w:type="gramStart"/>
+      <w:r>
+        <w:rPr>
+          <w:rStyle w:val="Hyperlink"/>
+          <w:lang w:val="en-US"/>
+        </w:rPr>
+        <w:t>doi:10.1016/j.chb</w:t>
+      </w:r>
+      <w:proofErr w:type="gramEnd"/>
+      <w:r>
+        <w:rPr>
+          <w:rStyle w:val="Hyperlink"/>
+          <w:lang w:val="en-US"/>
+        </w:rPr>
+        <w:t>.2020.106645</w:t>
+      </w:r>
+    </w:p>
+    <w:p>
+      <w:pPr>
         <w:ind w:left="720"/>
         <w:rPr>
           <w:lang w:val="en-US"/>
@@ -198,10 +329,11 @@
       <w:pPr>
         <w:ind w:left="1440"/>
         <w:rPr>
-          <w:lang w:val="en-US"/>
-        </w:rPr>
-      </w:pPr>
-      <w:hyperlink r:id="rId5" w:history="1">
+          <w:rStyle w:val="Hyperlink"/>
+          <w:lang w:val="en-US"/>
+        </w:rPr>
+      </w:pPr>
+      <w:hyperlink r:id="rId6" w:history="1">
         <w:r>
           <w:rPr>
             <w:rStyle w:val="Hyperlink"/>
@@ -213,6 +345,27 @@
     </w:p>
     <w:p>
       <w:pPr>
+        <w:ind w:left="1440"/>
+        <w:rPr>
+          <w:lang w:val="en-US"/>
+        </w:rPr>
+      </w:pPr>
+      <w:r>
+        <w:rPr>
+          <w:lang w:val="en-US"/>
+        </w:rPr>
+        <w:t xml:space="preserve">[1] “Just how harmful is social media? our experts weigh-in.,” Columbia University Mailman School of Public Health, </w:t>
+      </w:r>
+      <w:r>
+        <w:rPr>
+          <w:lang w:val="en-US"/>
+        </w:rPr>
+        <w:lastRenderedPageBreak/>
+        <w:t>https://www.publichealth.columbia.edu/news/just-how-harmful-social-media-our-experts-weigh (accessed Aug. 1, 2024).</w:t>
+      </w:r>
+    </w:p>
+    <w:p>
+      <w:pPr>
         <w:ind w:left="720"/>
         <w:rPr>
           <w:lang w:val="en-US"/>
@@ -275,6 +428,21 @@
     </w:p>
     <w:p>
       <w:pPr>
+        <w:tabs>
+          <w:tab w:val="left" w:pos="720"/>
+          <w:tab w:val="left" w:pos="1440"/>
+          <w:tab w:val="left" w:pos="2160"/>
+          <w:tab w:val="left" w:pos="2880"/>
+          <w:tab w:val="left" w:pos="3600"/>
+          <w:tab w:val="left" w:pos="4320"/>
+          <w:tab w:val="left" w:pos="5040"/>
+          <w:tab w:val="left" w:pos="5760"/>
+          <w:tab w:val="left" w:pos="6480"/>
+          <w:tab w:val="left" w:pos="7200"/>
+          <w:tab w:val="left" w:pos="7920"/>
+          <w:tab w:val="left" w:pos="8640"/>
+          <w:tab w:val="right" w:pos="9360"/>
+        </w:tabs>
         <w:ind w:left="720"/>
         <w:rPr>
           <w:lang w:val="en-US"/>
@@ -292,6 +460,55 @@
         </w:rPr>
         <w:t>https://www.un.org/sites/un2.un.org/files/attention_economy_feb.pdf</w:t>
       </w:r>
+      <w:r>
+        <w:rPr>
+          <w:lang w:val="en-US"/>
+        </w:rPr>
+        <w:tab/>
+      </w:r>
+    </w:p>
+    <w:p>
+      <w:pPr>
+        <w:tabs>
+          <w:tab w:val="left" w:pos="720"/>
+          <w:tab w:val="left" w:pos="1440"/>
+          <w:tab w:val="left" w:pos="2160"/>
+          <w:tab w:val="left" w:pos="2880"/>
+          <w:tab w:val="left" w:pos="3600"/>
+          <w:tab w:val="left" w:pos="4320"/>
+          <w:tab w:val="left" w:pos="5040"/>
+          <w:tab w:val="left" w:pos="5760"/>
+          <w:tab w:val="left" w:pos="6480"/>
+          <w:tab w:val="left" w:pos="7200"/>
+          <w:tab w:val="left" w:pos="7920"/>
+          <w:tab w:val="left" w:pos="8640"/>
+          <w:tab w:val="right" w:pos="9360"/>
+        </w:tabs>
+        <w:ind w:left="720"/>
+      </w:pPr>
+      <w:r>
+        <w:t xml:space="preserve">[1] C. L. Carpentier et al., “NEW ECONOMICS FOR SUSTAINABLE DEVELOPMENT,” ATTENTION ECONOMY, https://www.un.org/sites/un2.un.org/files/attention_economy_feb.pdf (accessed Aug. 1, 2024). </w:t>
+      </w:r>
+    </w:p>
+    <w:p>
+      <w:pPr>
+        <w:tabs>
+          <w:tab w:val="left" w:pos="720"/>
+          <w:tab w:val="left" w:pos="1440"/>
+          <w:tab w:val="left" w:pos="2160"/>
+          <w:tab w:val="left" w:pos="2880"/>
+          <w:tab w:val="left" w:pos="3600"/>
+          <w:tab w:val="left" w:pos="4320"/>
+          <w:tab w:val="left" w:pos="5040"/>
+          <w:tab w:val="left" w:pos="5760"/>
+          <w:tab w:val="left" w:pos="6480"/>
+          <w:tab w:val="left" w:pos="7200"/>
+          <w:tab w:val="left" w:pos="7920"/>
+          <w:tab w:val="left" w:pos="8640"/>
+          <w:tab w:val="right" w:pos="9360"/>
+        </w:tabs>
+        <w:ind w:left="720"/>
+      </w:pPr>
     </w:p>
     <w:p>
       <w:pPr>
@@ -316,7 +533,7 @@
       <w:r>
         <w:t>he analogy between the gambler and the social-media junkie is hard to avoid. Tristan Harris, Google’s former design ethicist, calls your smartphone “</w:t>
       </w:r>
-      <w:hyperlink r:id="rId6" w:history="1">
+      <w:hyperlink r:id="rId7" w:history="1">
         <w:r>
           <w:rPr>
             <w:rStyle w:val="Hyperlink"/>
@@ -325,11 +542,23 @@
         </w:r>
       </w:hyperlink>
       <w:r>
-        <w:t xml:space="preserve">”. Most smartphone apps use “intermittent variable rewards” to keep users hooked. Because rewards are variable, they are uncertain: you have to pull the lever to see what you are going to get. Adam Alter adds that, with the </w:t>
-      </w:r>
-      <w:r>
-        <w:lastRenderedPageBreak/>
-        <w:t>invention of the like button, users are gambling every time they post. The anthropologist Natasha Dow Schüll, based on her work on machine gambling, agrees.</w:t>
+        <w:t xml:space="preserve">”. Most smartphone apps use “intermittent variable rewards” to keep users hooked. Because rewards are variable, they are uncertain: you </w:t>
+      </w:r>
+      <w:proofErr w:type="gramStart"/>
+      <w:r>
+        <w:t>have to</w:t>
+      </w:r>
+      <w:proofErr w:type="gramEnd"/>
+      <w:r>
+        <w:t xml:space="preserve"> pull the lever to see what you are going to get. Adam Alter adds that, with the invention of the like button, users are gambling every time they post. The anthropologist Natasha Dow </w:t>
+      </w:r>
+      <w:proofErr w:type="spellStart"/>
+      <w:r>
+        <w:t>Schüll</w:t>
+      </w:r>
+      <w:proofErr w:type="spellEnd"/>
+      <w:r>
+        <w:t>, based on her work on machine gambling, agrees.</w:t>
       </w:r>
     </w:p>
     <w:p>
@@ -342,7 +571,7 @@
         </w:rPr>
         <w:t>h</w:t>
       </w:r>
-      <w:hyperlink r:id="rId7" w:history="1">
+      <w:hyperlink r:id="rId8" w:history="1">
         <w:r>
           <w:rPr>
             <w:rStyle w:val="Hyperlink"/>
@@ -361,6 +590,19 @@
     <w:p>
       <w:pPr>
         <w:ind w:left="720"/>
+      </w:pPr>
+      <w:r>
+        <w:t xml:space="preserve">[1] “The machine always wins: What drives our addiction to social media,” The Guardian, https://www.theguardian.com/technology/2019/aug/23/social-media-addiction-gambling (accessed Aug. 1, 2024). </w:t>
+      </w:r>
+    </w:p>
+    <w:p>
+      <w:pPr>
+        <w:ind w:left="720"/>
+      </w:pPr>
+    </w:p>
+    <w:p>
+      <w:pPr>
+        <w:ind w:left="720"/>
         <w:rPr>
           <w:lang w:val="en-US"/>
         </w:rPr>
@@ -401,9 +643,10 @@
         <w:rPr>
           <w:lang w:val="en-US"/>
         </w:rPr>
+        <w:lastRenderedPageBreak/>
         <w:t>ht</w:t>
       </w:r>
-      <w:hyperlink r:id="rId8" w:history="1">
+      <w:hyperlink r:id="rId9" w:history="1">
         <w:r>
           <w:rPr>
             <w:rStyle w:val="Hyperlink"/>
@@ -421,22 +664,49 @@
     </w:p>
     <w:p>
       <w:pPr>
-        <w:rPr>
-          <w:lang w:val="en-US"/>
-        </w:rPr>
-      </w:pPr>
-    </w:p>
-    <w:p>
-      <w:pPr>
-        <w:rPr>
-          <w:lang w:val="en-US"/>
-        </w:rPr>
-      </w:pPr>
-      <w:r>
-        <w:rPr>
-          <w:lang w:val="en-US"/>
-        </w:rPr>
-        <w:t>When we know something is harmful we don’t let children use it</w:t>
+        <w:ind w:left="1440"/>
+      </w:pPr>
+      <w:r>
+        <w:t xml:space="preserve">[1] N. Sinha, “Las Vegas and the attention economy,” Fallen Economist, https://falleneconomist.org/2022/07/11/las-vegas-and-the-attention-economy/ (accessed Aug. 1, 2024). </w:t>
+      </w:r>
+    </w:p>
+    <w:p>
+      <w:pPr>
+        <w:ind w:left="1440"/>
+      </w:pPr>
+    </w:p>
+    <w:p>
+      <w:pPr>
+        <w:rPr>
+          <w:lang w:val="en-US"/>
+        </w:rPr>
+      </w:pPr>
+    </w:p>
+    <w:p>
+      <w:pPr>
+        <w:rPr>
+          <w:lang w:val="en-US"/>
+        </w:rPr>
+      </w:pPr>
+      <w:r>
+        <w:rPr>
+          <w:lang w:val="en-US"/>
+        </w:rPr>
+        <w:t xml:space="preserve">When we know something is </w:t>
+      </w:r>
+      <w:proofErr w:type="gramStart"/>
+      <w:r>
+        <w:rPr>
+          <w:lang w:val="en-US"/>
+        </w:rPr>
+        <w:t>harmful</w:t>
+      </w:r>
+      <w:proofErr w:type="gramEnd"/>
+      <w:r>
+        <w:rPr>
+          <w:lang w:val="en-US"/>
+        </w:rPr>
+        <w:t xml:space="preserve"> we don’t let children use it</w:t>
       </w:r>
     </w:p>
     <w:p>
@@ -466,7 +736,7 @@
         </w:rPr>
         <w:t>h</w:t>
       </w:r>
-      <w:hyperlink r:id="rId9" w:history="1">
+      <w:hyperlink r:id="rId10" w:history="1">
         <w:r>
           <w:rPr>
             <w:rStyle w:val="Hyperlink"/>
@@ -485,6 +755,34 @@
     </w:p>
     <w:p>
       <w:pPr>
+        <w:ind w:left="720" w:firstLine="720"/>
+        <w:rPr>
+          <w:lang w:val="en-US"/>
+        </w:rPr>
+      </w:pPr>
+      <w:r>
+        <w:rPr>
+          <w:lang w:val="en-US"/>
+        </w:rPr>
+        <w:t xml:space="preserve">[1] P. </w:t>
+      </w:r>
+      <w:proofErr w:type="spellStart"/>
+      <w:r>
+        <w:rPr>
+          <w:lang w:val="en-US"/>
+        </w:rPr>
+        <w:t>Sulkunen</w:t>
+      </w:r>
+      <w:proofErr w:type="spellEnd"/>
+      <w:r>
+        <w:rPr>
+          <w:lang w:val="en-US"/>
+        </w:rPr>
+        <w:t>, Setting Limits: Gambling, Science and Public Policy. Oxford: Oxford University Press, 2019.</w:t>
+      </w:r>
+    </w:p>
+    <w:p>
+      <w:pPr>
         <w:ind w:left="720"/>
         <w:rPr>
           <w:lang w:val="en-US"/>
@@ -504,7 +802,7 @@
           <w:lang w:val="en-US"/>
         </w:rPr>
       </w:pPr>
-      <w:hyperlink r:id="rId10" w:history="1">
+      <w:hyperlink r:id="rId11" w:history="1">
         <w:r>
           <w:rPr>
             <w:rStyle w:val="Hyperlink"/>
@@ -517,11 +815,32 @@
     <w:p>
       <w:pPr>
         <w:ind w:left="1440"/>
-        <w:rPr>
-          <w:lang w:val="en-US"/>
-        </w:rPr>
-      </w:pPr>
-      <w:hyperlink r:id="rId11" w:history="1">
+      </w:pPr>
+    </w:p>
+    <w:p>
+      <w:pPr>
+        <w:ind w:left="1440"/>
+      </w:pPr>
+      <w:r>
+        <w:t xml:space="preserve">[1] </w:t>
+      </w:r>
+      <w:proofErr w:type="spellStart"/>
+      <w:r>
+        <w:t>Morningadvertiser</w:t>
+      </w:r>
+      <w:proofErr w:type="spellEnd"/>
+      <w:r>
+        <w:t xml:space="preserve">, “Putting the house in order,” morningadvertiser.co.uk, https://www.morningadvertiser.co.uk/Article/2019/02/11/Pub-policy-in-Parliament-over-the-last-225-years (accessed Aug. 1, 2024). </w:t>
+      </w:r>
+    </w:p>
+    <w:p>
+      <w:pPr>
+        <w:ind w:left="1440"/>
+        <w:rPr>
+          <w:lang w:val="en-US"/>
+        </w:rPr>
+      </w:pPr>
+      <w:hyperlink r:id="rId12" w:history="1">
         <w:r>
           <w:rPr>
             <w:rStyle w:val="Hyperlink"/>
@@ -558,11 +877,47 @@
           <w:lang w:val="en-US"/>
         </w:rPr>
       </w:pPr>
-      <w:r>
-        <w:rPr>
-          <w:lang w:val="en-US"/>
-        </w:rPr>
-        <w:t>Social Media should be regulate for everyone because it is harmful to everyone. But there are lots of things that are harmful to us and we let adults do them.</w:t>
+      <w:proofErr w:type="gramStart"/>
+      <w:r>
+        <w:rPr>
+          <w:lang w:val="en-US"/>
+        </w:rPr>
+        <w:t>Social Media</w:t>
+      </w:r>
+      <w:proofErr w:type="gramEnd"/>
+      <w:r>
+        <w:rPr>
+          <w:lang w:val="en-US"/>
+        </w:rPr>
+        <w:t xml:space="preserve"> should be </w:t>
+      </w:r>
+      <w:proofErr w:type="gramStart"/>
+      <w:r>
+        <w:rPr>
+          <w:lang w:val="en-US"/>
+        </w:rPr>
+        <w:t>regulate</w:t>
+      </w:r>
+      <w:proofErr w:type="gramEnd"/>
+      <w:r>
+        <w:rPr>
+          <w:lang w:val="en-US"/>
+        </w:rPr>
+        <w:t xml:space="preserve"> for everyone because it is harmful to everyone. But there are lots of things that are harmful to </w:t>
+      </w:r>
+      <w:proofErr w:type="gramStart"/>
+      <w:r>
+        <w:rPr>
+          <w:lang w:val="en-US"/>
+        </w:rPr>
+        <w:t>us</w:t>
+      </w:r>
+      <w:proofErr w:type="gramEnd"/>
+      <w:r>
+        <w:rPr>
+          <w:lang w:val="en-US"/>
+        </w:rPr>
+        <w:t xml:space="preserve"> and we let adults do them.</w:t>
       </w:r>
     </w:p>
     <w:p>
@@ -633,7 +988,21 @@
           <w:lang w:val="en-US"/>
         </w:rPr>
         <w:lastRenderedPageBreak/>
-        <w:t>You can’t let you problems that are created because you do these harmful things harm other people</w:t>
+        <w:t xml:space="preserve">You can’t let </w:t>
+      </w:r>
+      <w:proofErr w:type="gramStart"/>
+      <w:r>
+        <w:rPr>
+          <w:lang w:val="en-US"/>
+        </w:rPr>
+        <w:t>you</w:t>
+      </w:r>
+      <w:proofErr w:type="gramEnd"/>
+      <w:r>
+        <w:rPr>
+          <w:lang w:val="en-US"/>
+        </w:rPr>
+        <w:t xml:space="preserve"> problems that are created because you do these harmful things harm other people</w:t>
       </w:r>
     </w:p>
     <w:p>
@@ -659,7 +1028,35 @@
         <w:rPr>
           <w:lang w:val="en-US"/>
         </w:rPr>
-        <w:t xml:space="preserve"> people to do things they want even if it harm them they are free to do them, this rule breaks down when children don’t have a fully developed frontal lobe that controls decision. Need to find a source / ask if I need a source.</w:t>
+        <w:t xml:space="preserve"> people </w:t>
+      </w:r>
+      <w:proofErr w:type="gramStart"/>
+      <w:r>
+        <w:rPr>
+          <w:lang w:val="en-US"/>
+        </w:rPr>
+        <w:t>to do</w:t>
+      </w:r>
+      <w:proofErr w:type="gramEnd"/>
+      <w:r>
+        <w:rPr>
+          <w:lang w:val="en-US"/>
+        </w:rPr>
+        <w:t xml:space="preserve"> things they want even if it </w:t>
+      </w:r>
+      <w:proofErr w:type="gramStart"/>
+      <w:r>
+        <w:rPr>
+          <w:lang w:val="en-US"/>
+        </w:rPr>
+        <w:t>harm</w:t>
+      </w:r>
+      <w:proofErr w:type="gramEnd"/>
+      <w:r>
+        <w:rPr>
+          <w:lang w:val="en-US"/>
+        </w:rPr>
+        <w:t xml:space="preserve"> them they are free to do them, this rule breaks down when children don’t have a fully developed frontal lobe that controls decision. Need to find a source / ask if I need a source.</w:t>
       </w:r>
     </w:p>
     <w:p>
@@ -688,7 +1085,7 @@
           <w:lang w:val="en-US"/>
         </w:rPr>
       </w:pPr>
-      <w:hyperlink r:id="rId12" w:history="1">
+      <w:hyperlink r:id="rId13" w:history="1">
         <w:r>
           <w:rPr>
             <w:rStyle w:val="Hyperlink"/>
@@ -709,11 +1106,51 @@
     <w:p>
       <w:pPr>
         <w:ind w:left="1440"/>
-        <w:rPr>
-          <w:lang w:val="en-US"/>
-        </w:rPr>
-      </w:pPr>
-      <w:hyperlink r:id="rId13" w:history="1">
+      </w:pPr>
+      <w:r>
+        <w:t>[1] “</w:t>
+      </w:r>
+      <w:proofErr w:type="gramStart"/>
+      <w:r>
+        <w:t>Switzerland</w:t>
+      </w:r>
+      <w:r>
+        <w:rPr>
+          <w:rFonts w:ascii="Arial" w:hAnsi="Arial" w:cs="Arial"/>
+        </w:rPr>
+        <w:t> </w:t>
+      </w:r>
+      <w:r>
+        <w:t>:</w:t>
+      </w:r>
+      <w:proofErr w:type="gramEnd"/>
+      <w:r>
+        <w:t xml:space="preserve"> Worrying changes in the practice of Assisted Suicide,</w:t>
+      </w:r>
+      <w:r>
+        <w:rPr>
+          <w:rFonts w:ascii="Aptos" w:hAnsi="Aptos" w:cs="Aptos"/>
+        </w:rPr>
+        <w:t>”</w:t>
+      </w:r>
+      <w:r>
+        <w:t xml:space="preserve"> Alliance VITA, https://www.alliancevita.org/en/2023/10/switzerland-worrying-changes-in-the-practice-of-assisted-suicide/ (accessed Aug. 1, 2024). </w:t>
+      </w:r>
+    </w:p>
+    <w:p>
+      <w:pPr>
+        <w:ind w:left="1440"/>
+      </w:pPr>
+    </w:p>
+    <w:p>
+      <w:pPr>
+        <w:ind w:left="1440"/>
+        <w:rPr>
+          <w:rStyle w:val="Hyperlink"/>
+          <w:lang w:val="en-US"/>
+        </w:rPr>
+      </w:pPr>
+      <w:hyperlink r:id="rId14" w:history="1">
         <w:r>
           <w:rPr>
             <w:rStyle w:val="Hyperlink"/>
@@ -726,14 +1163,27 @@
     <w:p>
       <w:pPr>
         <w:ind w:left="1440"/>
-        <w:rPr>
-          <w:lang w:val="en-US"/>
-        </w:rPr>
-      </w:pPr>
+      </w:pPr>
+      <w:r>
+        <w:t xml:space="preserve">[1] “Universal declaration of human rights,” United Nations, https://www.un.org/en/about-us/universal-declaration-of-human-rights (accessed Aug. 1, 2024). </w:t>
+      </w:r>
     </w:p>
     <w:p>
       <w:pPr>
         <w:ind w:left="1440"/>
+      </w:pPr>
+    </w:p>
+    <w:p>
+      <w:pPr>
+        <w:ind w:left="1440"/>
+        <w:rPr>
+          <w:lang w:val="en-US"/>
+        </w:rPr>
+      </w:pPr>
+    </w:p>
+    <w:p>
+      <w:pPr>
+        <w:ind w:left="1440"/>
         <w:rPr>
           <w:lang w:val="en-US"/>
         </w:rPr>
@@ -756,10 +1206,11 @@
       <w:pPr>
         <w:ind w:left="1440"/>
         <w:rPr>
-          <w:lang w:val="en-US"/>
-        </w:rPr>
-      </w:pPr>
-      <w:hyperlink r:id="rId14" w:history="1">
+          <w:rStyle w:val="Hyperlink"/>
+          <w:lang w:val="en-US"/>
+        </w:rPr>
+      </w:pPr>
+      <w:hyperlink r:id="rId15" w:history="1">
         <w:r>
           <w:rPr>
             <w:rStyle w:val="Hyperlink"/>
@@ -771,17 +1222,45 @@
     </w:p>
     <w:p>
       <w:pPr>
-        <w:rPr>
-          <w:lang w:val="en-US"/>
-        </w:rPr>
-      </w:pPr>
-    </w:p>
-    <w:p>
-      <w:pPr>
-        <w:rPr>
-          <w:lang w:val="en-US"/>
-        </w:rPr>
-      </w:pPr>
+        <w:ind w:left="1440"/>
+        <w:rPr>
+          <w:lang w:val="en-US"/>
+        </w:rPr>
+      </w:pPr>
+      <w:r>
+        <w:rPr>
+          <w:lang w:val="en-US"/>
+        </w:rPr>
+        <w:t xml:space="preserve">[1] </w:t>
+      </w:r>
+      <w:proofErr w:type="spellStart"/>
+      <w:r>
+        <w:rPr>
+          <w:lang w:val="en-US"/>
+        </w:rPr>
+        <w:t>Olg</w:t>
+      </w:r>
+      <w:proofErr w:type="spellEnd"/>
+      <w:r>
+        <w:rPr>
+          <w:lang w:val="en-US"/>
+        </w:rPr>
+        <w:t xml:space="preserve">, “My </w:t>
+      </w:r>
+      <w:proofErr w:type="spellStart"/>
+      <w:r>
+        <w:rPr>
+          <w:lang w:val="en-US"/>
+        </w:rPr>
+        <w:t>Playbreak</w:t>
+      </w:r>
+      <w:proofErr w:type="spellEnd"/>
+      <w:r>
+        <w:rPr>
+          <w:lang w:val="en-US"/>
+        </w:rPr>
+        <w:t>: Learn more about gambling self-exclusion in Ontario,” OLG, https://www.olg.ca/en/my-play-break.html (accessed Aug. 1, 2024).</w:t>
+      </w:r>
       <w:r>
         <w:rPr>
           <w:lang w:val="en-US"/>
@@ -791,6 +1270,9 @@
     </w:p>
     <w:p>
       <w:pPr>
+        <w:tabs>
+          <w:tab w:val="left" w:pos="4972"/>
+        </w:tabs>
         <w:rPr>
           <w:lang w:val="en-US"/>
         </w:rPr>
@@ -802,12 +1284,101 @@
         <w:lastRenderedPageBreak/>
         <w:t>describe data mining to sell to advertisers</w:t>
       </w:r>
-    </w:p>
-    <w:p>
-      <w:pPr>
-        <w:rPr>
-          <w:lang w:val="en-US"/>
-        </w:rPr>
+      <w:r>
+        <w:rPr>
+          <w:lang w:val="en-US"/>
+        </w:rPr>
+        <w:tab/>
+      </w:r>
+    </w:p>
+    <w:p>
+      <w:pPr>
+        <w:tabs>
+          <w:tab w:val="left" w:pos="4972"/>
+        </w:tabs>
+        <w:rPr>
+          <w:lang w:val="en-US"/>
+        </w:rPr>
+      </w:pPr>
+    </w:p>
+    <w:p>
+      <w:pPr>
+        <w:tabs>
+          <w:tab w:val="left" w:pos="4972"/>
+        </w:tabs>
+        <w:rPr>
+          <w:lang w:val="en-US"/>
+        </w:rPr>
+      </w:pPr>
+      <w:r>
+        <w:rPr>
+          <w:lang w:val="en-US"/>
+        </w:rPr>
+        <w:t xml:space="preserve">Protective measures need to be put in place against companies that gain revenue through </w:t>
+      </w:r>
+      <w:r>
+        <w:rPr>
+          <w:lang w:val="en-US"/>
+        </w:rPr>
+        <w:t xml:space="preserve">just using the product without paying for it </w:t>
+      </w:r>
+      <w:r>
+        <w:rPr>
+          <w:lang w:val="en-US"/>
+        </w:rPr>
+        <w:t>to stop addictive design.</w:t>
+      </w:r>
+    </w:p>
+    <w:p>
+      <w:pPr>
+        <w:tabs>
+          <w:tab w:val="left" w:pos="4972"/>
+        </w:tabs>
+        <w:ind w:left="720"/>
+        <w:rPr>
+          <w:lang w:val="en-US"/>
+        </w:rPr>
+      </w:pPr>
+      <w:r>
+        <w:t>Addiction is a treatable, chronic medical disease involving complex interactions among brain circuits, genetics, the environment, and an individual’s life experiences. People with addiction use substances or engage in behaviors that become compulsive and often continue despite harmful consequences.</w:t>
+      </w:r>
+    </w:p>
+    <w:p>
+      <w:pPr>
+        <w:ind w:left="720"/>
+        <w:rPr>
+          <w:lang w:val="en-US"/>
+        </w:rPr>
+      </w:pPr>
+      <w:hyperlink r:id="rId16" w:history="1">
+        <w:r>
+          <w:rPr>
+            <w:rStyle w:val="Hyperlink"/>
+            <w:lang w:val="en-US"/>
+          </w:rPr>
+          <w:t>https://www.asam.org/quality-care/definition-of-addiction</w:t>
+        </w:r>
+      </w:hyperlink>
+    </w:p>
+    <w:p>
+      <w:pPr>
+        <w:ind w:left="720"/>
+      </w:pPr>
+      <w:r>
+        <w:t xml:space="preserve">[1] “What is the definition of </w:t>
+      </w:r>
+      <w:proofErr w:type="gramStart"/>
+      <w:r>
+        <w:t>addiction?,</w:t>
+      </w:r>
+      <w:proofErr w:type="gramEnd"/>
+      <w:r>
+        <w:t xml:space="preserve">” Default, https://www.asam.org/quality-care/definition-of-addiction (accessed Aug. 1, 2024). </w:t>
+      </w:r>
+    </w:p>
+    <w:p>
+      <w:pPr>
+        <w:ind w:left="720"/>
       </w:pPr>
     </w:p>
     <w:p>
@@ -829,37 +1400,73 @@
           <w:lang w:val="en-US"/>
         </w:rPr>
       </w:pPr>
-      <w:r>
-        <w:rPr>
-          <w:lang w:val="en-US"/>
-        </w:rPr>
-        <w:t xml:space="preserve">Insentivise addictive design – engagement metric </w:t>
-      </w:r>
-    </w:p>
-    <w:p>
-      <w:pPr>
-        <w:rPr>
-          <w:lang w:val="en-US"/>
-        </w:rPr>
-      </w:pPr>
-      <w:r>
-        <w:rPr>
-          <w:lang w:val="en-US"/>
-        </w:rPr>
-        <w:t xml:space="preserve">When something is addictive – gambling – it need to be protected and warned about </w:t>
-      </w:r>
-    </w:p>
-    <w:p>
-      <w:pPr>
-        <w:rPr>
-          <w:lang w:val="en-US"/>
-        </w:rPr>
-      </w:pPr>
-      <w:r>
-        <w:rPr>
-          <w:lang w:val="en-US"/>
-        </w:rPr>
-        <w:t>Why video games are different – have their own problems but are specifically are incentivized to be addictive. Different models, substricption just incentives wanting to play once a month, All up front, micro transactions</w:t>
+      <w:proofErr w:type="spellStart"/>
+      <w:r>
+        <w:rPr>
+          <w:lang w:val="en-US"/>
+        </w:rPr>
+        <w:t>Insentivise</w:t>
+      </w:r>
+      <w:proofErr w:type="spellEnd"/>
+      <w:r>
+        <w:rPr>
+          <w:lang w:val="en-US"/>
+        </w:rPr>
+        <w:t xml:space="preserve"> addictive design – engagement metric </w:t>
+      </w:r>
+    </w:p>
+    <w:p>
+      <w:pPr>
+        <w:rPr>
+          <w:lang w:val="en-US"/>
+        </w:rPr>
+      </w:pPr>
+      <w:r>
+        <w:rPr>
+          <w:lang w:val="en-US"/>
+        </w:rPr>
+        <w:t xml:space="preserve">When something is addictive – gambling – it </w:t>
+      </w:r>
+      <w:proofErr w:type="gramStart"/>
+      <w:r>
+        <w:rPr>
+          <w:lang w:val="en-US"/>
+        </w:rPr>
+        <w:t>need</w:t>
+      </w:r>
+      <w:proofErr w:type="gramEnd"/>
+      <w:r>
+        <w:rPr>
+          <w:lang w:val="en-US"/>
+        </w:rPr>
+        <w:t xml:space="preserve"> to be protected and warned about </w:t>
+      </w:r>
+    </w:p>
+    <w:p>
+      <w:pPr>
+        <w:rPr>
+          <w:lang w:val="en-US"/>
+        </w:rPr>
+      </w:pPr>
+      <w:r>
+        <w:rPr>
+          <w:lang w:val="en-US"/>
+        </w:rPr>
+        <w:t xml:space="preserve">Why video games are different – have their own problems but are specifically are incentivized to be addictive. Different models, </w:t>
+      </w:r>
+      <w:proofErr w:type="spellStart"/>
+      <w:r>
+        <w:rPr>
+          <w:lang w:val="en-US"/>
+        </w:rPr>
+        <w:t>substricption</w:t>
+      </w:r>
+      <w:proofErr w:type="spellEnd"/>
+      <w:r>
+        <w:rPr>
+          <w:lang w:val="en-US"/>
+        </w:rPr>
+        <w:t xml:space="preserve"> just incentives wanting to play once a month, All up front, micro transactions</w:t>
       </w:r>
     </w:p>
     <w:p>
@@ -885,20 +1492,73 @@
         <w:rPr>
           <w:lang w:val="en-US"/>
         </w:rPr>
-        <w:t>Google – best counter argument, google make all money from data, but you aren’t incentivized to use for every, you need to actively be seaking for something and you want to be answered as fast as possible. Not in entertainment.</w:t>
-      </w:r>
-    </w:p>
-    <w:p>
-      <w:pPr>
-        <w:rPr>
-          <w:lang w:val="en-US"/>
-        </w:rPr>
-      </w:pPr>
-      <w:r>
-        <w:rPr>
-          <w:lang w:val="en-US"/>
-        </w:rPr>
-        <w:t>Television – very close relative – not 100% insensitived to be addictive</w:t>
+        <w:t xml:space="preserve">Google – best counter argument, google make all money from data, but you aren’t incentivized to use for every, you need to actively be </w:t>
+      </w:r>
+      <w:proofErr w:type="spellStart"/>
+      <w:r>
+        <w:rPr>
+          <w:lang w:val="en-US"/>
+        </w:rPr>
+        <w:t>seaking</w:t>
+      </w:r>
+      <w:proofErr w:type="spellEnd"/>
+      <w:r>
+        <w:rPr>
+          <w:lang w:val="en-US"/>
+        </w:rPr>
+        <w:t xml:space="preserve"> for something and you want to be answered as fast as possible. Not in entertainment.</w:t>
+      </w:r>
+    </w:p>
+    <w:p>
+      <w:pPr>
+        <w:tabs>
+          <w:tab w:val="left" w:pos="7825"/>
+        </w:tabs>
+        <w:rPr>
+          <w:lang w:val="en-US"/>
+        </w:rPr>
+      </w:pPr>
+      <w:r>
+        <w:rPr>
+          <w:lang w:val="en-US"/>
+        </w:rPr>
+        <w:t xml:space="preserve">Television – very close relative – not 100% </w:t>
+      </w:r>
+      <w:proofErr w:type="spellStart"/>
+      <w:r>
+        <w:rPr>
+          <w:lang w:val="en-US"/>
+        </w:rPr>
+        <w:t>insensitived</w:t>
+      </w:r>
+      <w:proofErr w:type="spellEnd"/>
+      <w:r>
+        <w:rPr>
+          <w:lang w:val="en-US"/>
+        </w:rPr>
+        <w:t xml:space="preserve"> to be addictive</w:t>
+      </w:r>
+      <w:r>
+        <w:rPr>
+          <w:lang w:val="en-US"/>
+        </w:rPr>
+        <w:tab/>
+      </w:r>
+    </w:p>
+    <w:p>
+      <w:pPr>
+        <w:tabs>
+          <w:tab w:val="left" w:pos="7825"/>
+        </w:tabs>
+        <w:rPr>
+          <w:lang w:val="en-US"/>
+        </w:rPr>
+      </w:pPr>
+      <w:r>
+        <w:rPr>
+          <w:lang w:val="en-US"/>
+        </w:rPr>
+        <w:t>Sporting events</w:t>
       </w:r>
     </w:p>
     <w:p>
@@ -960,25 +1620,36 @@
           <w:lang w:val="en-US"/>
         </w:rPr>
       </w:pPr>
-      <w:r>
-        <w:rPr>
-          <w:lang w:val="en-US"/>
-        </w:rPr>
+      <w:proofErr w:type="spellStart"/>
+      <w:r>
+        <w:rPr>
+          <w:lang w:val="en-US"/>
+        </w:rPr>
+        <w:lastRenderedPageBreak/>
         <w:t>Kantiensim</w:t>
       </w:r>
-    </w:p>
-    <w:p>
-      <w:pPr>
-        <w:rPr>
-          <w:lang w:val="en-US"/>
-        </w:rPr>
-      </w:pPr>
-      <w:r>
-        <w:rPr>
-          <w:lang w:val="en-US"/>
-        </w:rPr>
-        <w:t>Rules Unitilaterism</w:t>
-      </w:r>
+      <w:proofErr w:type="spellEnd"/>
+    </w:p>
+    <w:p>
+      <w:pPr>
+        <w:rPr>
+          <w:lang w:val="en-US"/>
+        </w:rPr>
+      </w:pPr>
+      <w:r>
+        <w:rPr>
+          <w:lang w:val="en-US"/>
+        </w:rPr>
+        <w:t xml:space="preserve">Rules </w:t>
+      </w:r>
+      <w:proofErr w:type="spellStart"/>
+      <w:r>
+        <w:rPr>
+          <w:lang w:val="en-US"/>
+        </w:rPr>
+        <w:t>Unitilaterism</w:t>
+      </w:r>
+      <w:proofErr w:type="spellEnd"/>
     </w:p>
     <w:p>
       <w:pPr>
@@ -1619,7 +2290,6 @@
   <w:style w:type="character" w:default="1" w:styleId="DefaultParagraphFont">
     <w:name w:val="Default Paragraph Font"/>
     <w:uiPriority w:val="1"/>
-    <w:semiHidden/>
     <w:unhideWhenUsed/>
   </w:style>
   <w:style w:type="table" w:default="1" w:styleId="TableNormal">

</xml_diff>